<commit_message>
Update official Word documentation (DOCX) and project proposal markdown with comprehensive itemized OPEX and Net Annual Cash Flow tables
</commit_message>
<xml_diff>
--- a/docs/Carbon_Heist_Mitigation_Documentation.docx
+++ b/docs/Carbon_Heist_Mitigation_Documentation.docx
@@ -381,6 +381,1210 @@
         <w:t xml:space="preserve"> Planning &amp; Management</w:t>
       </w:r>
     </w:p>
+    <w:p>
+      <w:pPr>
+        <w:pStyle w:val="Heading2"/>
+      </w:pPr>
+      <w:r>
+        <w:t>1.1.5 Strategic Decarbonization Financial Model (CAPEX, Annual OPEX &amp; Net Cash Flow)</w:t>
+      </w:r>
+    </w:p>
+    <w:p>
+      <w:pPr/>
+      <w:r>
+        <w:t>The following financial model details the portfolio-wide deployment of the 5 Strategic Decarbonization Playbooks across all 11,639 Local Law 97 audited properties, demonstrating initial CAPEX, itemized recurring Annual OPEX ($15.70M/yr total), Gross Annual Savings ($656.63M/yr), Net Annual Benefit ($640.93M/yr), and Payback horizons:</w:t>
+      </w:r>
+    </w:p>
+    <w:tbl>
+      <w:tblPr>
+        <w:tblW w:type="auto" w:w="0"/>
+        <w:jc w:val="center"/>
+        <w:tblLook w:firstColumn="1" w:firstRow="1" w:lastColumn="0" w:lastRow="0" w:noHBand="0" w:noVBand="1" w:val="04A0"/>
+      </w:tblPr>
+      <w:tblGrid>
+        <w:gridCol w:w="1440"/>
+        <w:gridCol w:w="1440"/>
+        <w:gridCol w:w="1440"/>
+        <w:gridCol w:w="1440"/>
+        <w:gridCol w:w="1440"/>
+        <w:gridCol w:w="1440"/>
+        <w:gridCol w:w="1440"/>
+      </w:tblGrid>
+      <w:tr>
+        <w:tc>
+          <w:tcPr>
+            <w:tcW w:type="dxa" w:w="1440"/>
+            <w:shd w:fill="0F172A"/>
+            <w:tcMar>
+              <w:top w:w="120" w:type="dxa"/>
+              <w:bottom w:w="120" w:type="dxa"/>
+              <w:left w:w="150" w:type="dxa"/>
+              <w:right w:w="150" w:type="dxa"/>
+            </w:tcMar>
+          </w:tcPr>
+          <w:p>
+            <w:pPr>
+              <w:jc w:val="center"/>
+            </w:pPr>
+            <w:r>
+              <w:rPr>
+                <w:b/>
+                <w:color w:val="FFFFFF"/>
+                <w:sz w:val="18"/>
+              </w:rPr>
+              <w:t>Playbook ID &amp; Strategy</w:t>
+            </w:r>
+          </w:p>
+        </w:tc>
+        <w:tc>
+          <w:tcPr>
+            <w:tcW w:type="dxa" w:w="1440"/>
+            <w:shd w:fill="0F172A"/>
+            <w:tcMar>
+              <w:top w:w="120" w:type="dxa"/>
+              <w:bottom w:w="120" w:type="dxa"/>
+              <w:left w:w="150" w:type="dxa"/>
+              <w:right w:w="150" w:type="dxa"/>
+            </w:tcMar>
+          </w:tcPr>
+          <w:p>
+            <w:pPr>
+              <w:jc w:val="center"/>
+            </w:pPr>
+            <w:r>
+              <w:rPr>
+                <w:b/>
+                <w:color w:val="FFFFFF"/>
+                <w:sz w:val="18"/>
+              </w:rPr>
+              <w:t>Initial CAPEX</w:t>
+            </w:r>
+          </w:p>
+        </w:tc>
+        <w:tc>
+          <w:tcPr>
+            <w:tcW w:type="dxa" w:w="1440"/>
+            <w:shd w:fill="0F172A"/>
+            <w:tcMar>
+              <w:top w:w="120" w:type="dxa"/>
+              <w:bottom w:w="120" w:type="dxa"/>
+              <w:left w:w="150" w:type="dxa"/>
+              <w:right w:w="150" w:type="dxa"/>
+            </w:tcMar>
+          </w:tcPr>
+          <w:p>
+            <w:pPr>
+              <w:jc w:val="center"/>
+            </w:pPr>
+            <w:r>
+              <w:rPr>
+                <w:b/>
+                <w:color w:val="FFFFFF"/>
+                <w:sz w:val="18"/>
+              </w:rPr>
+              <w:t>Annual OPEX</w:t>
+            </w:r>
+          </w:p>
+        </w:tc>
+        <w:tc>
+          <w:tcPr>
+            <w:tcW w:type="dxa" w:w="1440"/>
+            <w:shd w:fill="0F172A"/>
+            <w:tcMar>
+              <w:top w:w="120" w:type="dxa"/>
+              <w:bottom w:w="120" w:type="dxa"/>
+              <w:left w:w="150" w:type="dxa"/>
+              <w:right w:w="150" w:type="dxa"/>
+            </w:tcMar>
+          </w:tcPr>
+          <w:p>
+            <w:pPr>
+              <w:jc w:val="center"/>
+            </w:pPr>
+            <w:r>
+              <w:rPr>
+                <w:b/>
+                <w:color w:val="FFFFFF"/>
+                <w:sz w:val="18"/>
+              </w:rPr>
+              <w:t>Gross Savings / yr</w:t>
+            </w:r>
+          </w:p>
+        </w:tc>
+        <w:tc>
+          <w:tcPr>
+            <w:tcW w:type="dxa" w:w="1440"/>
+            <w:shd w:fill="0F172A"/>
+            <w:tcMar>
+              <w:top w:w="120" w:type="dxa"/>
+              <w:bottom w:w="120" w:type="dxa"/>
+              <w:left w:w="150" w:type="dxa"/>
+              <w:right w:w="150" w:type="dxa"/>
+            </w:tcMar>
+          </w:tcPr>
+          <w:p>
+            <w:pPr>
+              <w:jc w:val="center"/>
+            </w:pPr>
+            <w:r>
+              <w:rPr>
+                <w:b/>
+                <w:color w:val="FFFFFF"/>
+                <w:sz w:val="18"/>
+              </w:rPr>
+              <w:t>Net Benefit / yr</w:t>
+            </w:r>
+          </w:p>
+        </w:tc>
+        <w:tc>
+          <w:tcPr>
+            <w:tcW w:type="dxa" w:w="1440"/>
+            <w:shd w:fill="0F172A"/>
+            <w:tcMar>
+              <w:top w:w="120" w:type="dxa"/>
+              <w:bottom w:w="120" w:type="dxa"/>
+              <w:left w:w="150" w:type="dxa"/>
+              <w:right w:w="150" w:type="dxa"/>
+            </w:tcMar>
+          </w:tcPr>
+          <w:p>
+            <w:pPr>
+              <w:jc w:val="center"/>
+            </w:pPr>
+            <w:r>
+              <w:rPr>
+                <w:b/>
+                <w:color w:val="FFFFFF"/>
+                <w:sz w:val="18"/>
+              </w:rPr>
+              <w:t>Payback</w:t>
+            </w:r>
+          </w:p>
+        </w:tc>
+        <w:tc>
+          <w:tcPr>
+            <w:tcW w:type="dxa" w:w="1440"/>
+            <w:shd w:fill="0F172A"/>
+            <w:tcMar>
+              <w:top w:w="120" w:type="dxa"/>
+              <w:bottom w:w="120" w:type="dxa"/>
+              <w:left w:w="150" w:type="dxa"/>
+              <w:right w:w="150" w:type="dxa"/>
+            </w:tcMar>
+          </w:tcPr>
+          <w:p>
+            <w:pPr>
+              <w:jc w:val="center"/>
+            </w:pPr>
+            <w:r>
+              <w:rPr>
+                <w:b/>
+                <w:color w:val="FFFFFF"/>
+                <w:sz w:val="18"/>
+              </w:rPr>
+              <w:t>Operational &amp; Maintenance Scope</w:t>
+            </w:r>
+          </w:p>
+        </w:tc>
+      </w:tr>
+      <w:tr>
+        <w:tc>
+          <w:tcPr>
+            <w:tcW w:type="dxa" w:w="1440"/>
+            <w:shd w:fill="FFFFFF"/>
+            <w:tcMar>
+              <w:top w:w="100" w:type="dxa"/>
+              <w:bottom w:w="100" w:type="dxa"/>
+              <w:left w:w="120" w:type="dxa"/>
+              <w:right w:w="120" w:type="dxa"/>
+            </w:tcMar>
+          </w:tcPr>
+          <w:p>
+            <w:pPr>
+              <w:jc w:val="left"/>
+            </w:pPr>
+            <w:r>
+              <w:rPr>
+                <w:b/>
+                <w:sz w:val="17"/>
+              </w:rPr>
+              <w:t>Playbook 01: Surgical Strike</w:t>
+            </w:r>
+          </w:p>
+        </w:tc>
+        <w:tc>
+          <w:tcPr>
+            <w:tcW w:type="dxa" w:w="1440"/>
+            <w:shd w:fill="FFFFFF"/>
+            <w:tcMar>
+              <w:top w:w="100" w:type="dxa"/>
+              <w:bottom w:w="100" w:type="dxa"/>
+              <w:left w:w="120" w:type="dxa"/>
+              <w:right w:w="120" w:type="dxa"/>
+            </w:tcMar>
+          </w:tcPr>
+          <w:p>
+            <w:pPr>
+              <w:jc w:val="right"/>
+            </w:pPr>
+            <w:r>
+              <w:rPr>
+                <w:sz w:val="17"/>
+              </w:rPr>
+              <w:t>$500,000</w:t>
+            </w:r>
+          </w:p>
+        </w:tc>
+        <w:tc>
+          <w:tcPr>
+            <w:tcW w:type="dxa" w:w="1440"/>
+            <w:shd w:fill="FFFFFF"/>
+            <w:tcMar>
+              <w:top w:w="100" w:type="dxa"/>
+              <w:bottom w:w="100" w:type="dxa"/>
+              <w:left w:w="120" w:type="dxa"/>
+              <w:right w:w="120" w:type="dxa"/>
+            </w:tcMar>
+          </w:tcPr>
+          <w:p>
+            <w:pPr>
+              <w:jc w:val="right"/>
+            </w:pPr>
+            <w:r>
+              <w:rPr>
+                <w:sz w:val="17"/>
+              </w:rPr>
+              <w:t>$45,000 / yr</w:t>
+            </w:r>
+          </w:p>
+        </w:tc>
+        <w:tc>
+          <w:tcPr>
+            <w:tcW w:type="dxa" w:w="1440"/>
+            <w:shd w:fill="FFFFFF"/>
+            <w:tcMar>
+              <w:top w:w="100" w:type="dxa"/>
+              <w:bottom w:w="100" w:type="dxa"/>
+              <w:left w:w="120" w:type="dxa"/>
+              <w:right w:w="120" w:type="dxa"/>
+            </w:tcMar>
+          </w:tcPr>
+          <w:p>
+            <w:pPr>
+              <w:jc w:val="right"/>
+            </w:pPr>
+            <w:r>
+              <w:rPr>
+                <w:sz w:val="17"/>
+              </w:rPr>
+              <w:t>$20.59M</w:t>
+            </w:r>
+          </w:p>
+        </w:tc>
+        <w:tc>
+          <w:tcPr>
+            <w:tcW w:type="dxa" w:w="1440"/>
+            <w:shd w:fill="FFFFFF"/>
+            <w:tcMar>
+              <w:top w:w="100" w:type="dxa"/>
+              <w:bottom w:w="100" w:type="dxa"/>
+              <w:left w:w="120" w:type="dxa"/>
+              <w:right w:w="120" w:type="dxa"/>
+            </w:tcMar>
+          </w:tcPr>
+          <w:p>
+            <w:pPr>
+              <w:jc w:val="right"/>
+            </w:pPr>
+            <w:r>
+              <w:rPr>
+                <w:sz w:val="17"/>
+              </w:rPr>
+              <w:t>$20.55M</w:t>
+            </w:r>
+          </w:p>
+        </w:tc>
+        <w:tc>
+          <w:tcPr>
+            <w:tcW w:type="dxa" w:w="1440"/>
+            <w:shd w:fill="FFFFFF"/>
+            <w:tcMar>
+              <w:top w:w="100" w:type="dxa"/>
+              <w:bottom w:w="100" w:type="dxa"/>
+              <w:left w:w="120" w:type="dxa"/>
+              <w:right w:w="120" w:type="dxa"/>
+            </w:tcMar>
+          </w:tcPr>
+          <w:p>
+            <w:pPr>
+              <w:jc w:val="center"/>
+            </w:pPr>
+            <w:r>
+              <w:rPr>
+                <w:sz w:val="17"/>
+              </w:rPr>
+              <w:t>0.02 Yrs (~8 Days)</w:t>
+            </w:r>
+          </w:p>
+        </w:tc>
+        <w:tc>
+          <w:tcPr>
+            <w:tcW w:type="dxa" w:w="1440"/>
+            <w:shd w:fill="FFFFFF"/>
+            <w:tcMar>
+              <w:top w:w="100" w:type="dxa"/>
+              <w:bottom w:w="100" w:type="dxa"/>
+              <w:left w:w="120" w:type="dxa"/>
+              <w:right w:w="120" w:type="dxa"/>
+            </w:tcMar>
+          </w:tcPr>
+          <w:p>
+            <w:pPr>
+              <w:jc w:val="left"/>
+            </w:pPr>
+            <w:r>
+              <w:rPr>
+                <w:sz w:val="17"/>
+              </w:rPr>
+              <w:t>Level 2 audits, BMS scheduling &amp; quarterly sensor calibrations.</w:t>
+            </w:r>
+          </w:p>
+        </w:tc>
+      </w:tr>
+      <w:tr>
+        <w:tc>
+          <w:tcPr>
+            <w:tcW w:type="dxa" w:w="1440"/>
+            <w:shd w:fill="F8FAFC"/>
+            <w:tcMar>
+              <w:top w:w="100" w:type="dxa"/>
+              <w:bottom w:w="100" w:type="dxa"/>
+              <w:left w:w="120" w:type="dxa"/>
+              <w:right w:w="120" w:type="dxa"/>
+            </w:tcMar>
+          </w:tcPr>
+          <w:p>
+            <w:pPr>
+              <w:jc w:val="left"/>
+            </w:pPr>
+            <w:r>
+              <w:rPr>
+                <w:b/>
+                <w:sz w:val="17"/>
+              </w:rPr>
+              <w:t>Playbook 02: Retro-commissioning</w:t>
+            </w:r>
+          </w:p>
+        </w:tc>
+        <w:tc>
+          <w:tcPr>
+            <w:tcW w:type="dxa" w:w="1440"/>
+            <w:shd w:fill="F8FAFC"/>
+            <w:tcMar>
+              <w:top w:w="100" w:type="dxa"/>
+              <w:bottom w:w="100" w:type="dxa"/>
+              <w:left w:w="120" w:type="dxa"/>
+              <w:right w:w="120" w:type="dxa"/>
+            </w:tcMar>
+          </w:tcPr>
+          <w:p>
+            <w:pPr>
+              <w:jc w:val="right"/>
+            </w:pPr>
+            <w:r>
+              <w:rPr>
+                <w:sz w:val="17"/>
+              </w:rPr>
+              <w:t>$802.17M</w:t>
+            </w:r>
+          </w:p>
+        </w:tc>
+        <w:tc>
+          <w:tcPr>
+            <w:tcW w:type="dxa" w:w="1440"/>
+            <w:shd w:fill="F8FAFC"/>
+            <w:tcMar>
+              <w:top w:w="100" w:type="dxa"/>
+              <w:bottom w:w="100" w:type="dxa"/>
+              <w:left w:w="120" w:type="dxa"/>
+              <w:right w:w="120" w:type="dxa"/>
+            </w:tcMar>
+          </w:tcPr>
+          <w:p>
+            <w:pPr>
+              <w:jc w:val="right"/>
+            </w:pPr>
+            <w:r>
+              <w:rPr>
+                <w:sz w:val="17"/>
+              </w:rPr>
+              <w:t>$3.25M / yr</w:t>
+            </w:r>
+          </w:p>
+        </w:tc>
+        <w:tc>
+          <w:tcPr>
+            <w:tcW w:type="dxa" w:w="1440"/>
+            <w:shd w:fill="F8FAFC"/>
+            <w:tcMar>
+              <w:top w:w="100" w:type="dxa"/>
+              <w:bottom w:w="100" w:type="dxa"/>
+              <w:left w:w="120" w:type="dxa"/>
+              <w:right w:w="120" w:type="dxa"/>
+            </w:tcMar>
+          </w:tcPr>
+          <w:p>
+            <w:pPr>
+              <w:jc w:val="right"/>
+            </w:pPr>
+            <w:r>
+              <w:rPr>
+                <w:sz w:val="17"/>
+              </w:rPr>
+              <w:t>$243.62M</w:t>
+            </w:r>
+          </w:p>
+        </w:tc>
+        <w:tc>
+          <w:tcPr>
+            <w:tcW w:type="dxa" w:w="1440"/>
+            <w:shd w:fill="F8FAFC"/>
+            <w:tcMar>
+              <w:top w:w="100" w:type="dxa"/>
+              <w:bottom w:w="100" w:type="dxa"/>
+              <w:left w:w="120" w:type="dxa"/>
+              <w:right w:w="120" w:type="dxa"/>
+            </w:tcMar>
+          </w:tcPr>
+          <w:p>
+            <w:pPr>
+              <w:jc w:val="right"/>
+            </w:pPr>
+            <w:r>
+              <w:rPr>
+                <w:sz w:val="17"/>
+              </w:rPr>
+              <w:t>$240.37M</w:t>
+            </w:r>
+          </w:p>
+        </w:tc>
+        <w:tc>
+          <w:tcPr>
+            <w:tcW w:type="dxa" w:w="1440"/>
+            <w:shd w:fill="F8FAFC"/>
+            <w:tcMar>
+              <w:top w:w="100" w:type="dxa"/>
+              <w:bottom w:w="100" w:type="dxa"/>
+              <w:left w:w="120" w:type="dxa"/>
+              <w:right w:w="120" w:type="dxa"/>
+            </w:tcMar>
+          </w:tcPr>
+          <w:p>
+            <w:pPr>
+              <w:jc w:val="center"/>
+            </w:pPr>
+            <w:r>
+              <w:rPr>
+                <w:sz w:val="17"/>
+              </w:rPr>
+              <w:t>3.29 Yrs</w:t>
+            </w:r>
+          </w:p>
+        </w:tc>
+        <w:tc>
+          <w:tcPr>
+            <w:tcW w:type="dxa" w:w="1440"/>
+            <w:shd w:fill="F8FAFC"/>
+            <w:tcMar>
+              <w:top w:w="100" w:type="dxa"/>
+              <w:bottom w:w="100" w:type="dxa"/>
+              <w:left w:w="120" w:type="dxa"/>
+              <w:right w:w="120" w:type="dxa"/>
+            </w:tcMar>
+          </w:tcPr>
+          <w:p>
+            <w:pPr>
+              <w:jc w:val="left"/>
+            </w:pPr>
+            <w:r>
+              <w:rPr>
+                <w:sz w:val="17"/>
+              </w:rPr>
+              <w:t>RCx ($1.50/ft²), continuous FDD software &amp; semi-annual VAV tuning.</w:t>
+            </w:r>
+          </w:p>
+        </w:tc>
+      </w:tr>
+      <w:tr>
+        <w:tc>
+          <w:tcPr>
+            <w:tcW w:type="dxa" w:w="1440"/>
+            <w:shd w:fill="FFFFFF"/>
+            <w:tcMar>
+              <w:top w:w="100" w:type="dxa"/>
+              <w:bottom w:w="100" w:type="dxa"/>
+              <w:left w:w="120" w:type="dxa"/>
+              <w:right w:w="120" w:type="dxa"/>
+            </w:tcMar>
+          </w:tcPr>
+          <w:p>
+            <w:pPr>
+              <w:jc w:val="left"/>
+            </w:pPr>
+            <w:r>
+              <w:rPr>
+                <w:b/>
+                <w:sz w:val="17"/>
+              </w:rPr>
+              <w:t>Playbook 03: 1960s Smart Scale</w:t>
+            </w:r>
+          </w:p>
+        </w:tc>
+        <w:tc>
+          <w:tcPr>
+            <w:tcW w:type="dxa" w:w="1440"/>
+            <w:shd w:fill="FFFFFF"/>
+            <w:tcMar>
+              <w:top w:w="100" w:type="dxa"/>
+              <w:bottom w:w="100" w:type="dxa"/>
+              <w:left w:w="120" w:type="dxa"/>
+              <w:right w:w="120" w:type="dxa"/>
+            </w:tcMar>
+          </w:tcPr>
+          <w:p>
+            <w:pPr>
+              <w:jc w:val="right"/>
+            </w:pPr>
+            <w:r>
+              <w:rPr>
+                <w:sz w:val="17"/>
+              </w:rPr>
+              <w:t>$785.24M</w:t>
+            </w:r>
+          </w:p>
+        </w:tc>
+        <w:tc>
+          <w:tcPr>
+            <w:tcW w:type="dxa" w:w="1440"/>
+            <w:shd w:fill="FFFFFF"/>
+            <w:tcMar>
+              <w:top w:w="100" w:type="dxa"/>
+              <w:bottom w:w="100" w:type="dxa"/>
+              <w:left w:w="120" w:type="dxa"/>
+              <w:right w:w="120" w:type="dxa"/>
+            </w:tcMar>
+          </w:tcPr>
+          <w:p>
+            <w:pPr>
+              <w:jc w:val="right"/>
+            </w:pPr>
+            <w:r>
+              <w:rPr>
+                <w:sz w:val="17"/>
+              </w:rPr>
+              <w:t>$2.80M / yr</w:t>
+            </w:r>
+          </w:p>
+        </w:tc>
+        <w:tc>
+          <w:tcPr>
+            <w:tcW w:type="dxa" w:w="1440"/>
+            <w:shd w:fill="FFFFFF"/>
+            <w:tcMar>
+              <w:top w:w="100" w:type="dxa"/>
+              <w:bottom w:w="100" w:type="dxa"/>
+              <w:left w:w="120" w:type="dxa"/>
+              <w:right w:w="120" w:type="dxa"/>
+            </w:tcMar>
+          </w:tcPr>
+          <w:p>
+            <w:pPr>
+              <w:jc w:val="right"/>
+            </w:pPr>
+            <w:r>
+              <w:rPr>
+                <w:sz w:val="17"/>
+              </w:rPr>
+              <w:t>$88.03M</w:t>
+            </w:r>
+          </w:p>
+        </w:tc>
+        <w:tc>
+          <w:tcPr>
+            <w:tcW w:type="dxa" w:w="1440"/>
+            <w:shd w:fill="FFFFFF"/>
+            <w:tcMar>
+              <w:top w:w="100" w:type="dxa"/>
+              <w:bottom w:w="100" w:type="dxa"/>
+              <w:left w:w="120" w:type="dxa"/>
+              <w:right w:w="120" w:type="dxa"/>
+            </w:tcMar>
+          </w:tcPr>
+          <w:p>
+            <w:pPr>
+              <w:jc w:val="right"/>
+            </w:pPr>
+            <w:r>
+              <w:rPr>
+                <w:sz w:val="17"/>
+              </w:rPr>
+              <w:t>$85.23M</w:t>
+            </w:r>
+          </w:p>
+        </w:tc>
+        <w:tc>
+          <w:tcPr>
+            <w:tcW w:type="dxa" w:w="1440"/>
+            <w:shd w:fill="FFFFFF"/>
+            <w:tcMar>
+              <w:top w:w="100" w:type="dxa"/>
+              <w:bottom w:w="100" w:type="dxa"/>
+              <w:left w:w="120" w:type="dxa"/>
+              <w:right w:w="120" w:type="dxa"/>
+            </w:tcMar>
+          </w:tcPr>
+          <w:p>
+            <w:pPr>
+              <w:jc w:val="center"/>
+            </w:pPr>
+            <w:r>
+              <w:rPr>
+                <w:sz w:val="17"/>
+              </w:rPr>
+              <w:t>8.92 Yrs</w:t>
+            </w:r>
+          </w:p>
+        </w:tc>
+        <w:tc>
+          <w:tcPr>
+            <w:tcW w:type="dxa" w:w="1440"/>
+            <w:shd w:fill="FFFFFF"/>
+            <w:tcMar>
+              <w:top w:w="100" w:type="dxa"/>
+              <w:bottom w:w="100" w:type="dxa"/>
+              <w:left w:w="120" w:type="dxa"/>
+              <w:right w:w="120" w:type="dxa"/>
+            </w:tcMar>
+          </w:tcPr>
+          <w:p>
+            <w:pPr>
+              <w:jc w:val="left"/>
+            </w:pPr>
+            <w:r>
+              <w:rPr>
+                <w:sz w:val="17"/>
+              </w:rPr>
+              <w:t>Networked LED, VFD motors ($2.50/ft²) &amp; preventative maintenance.</w:t>
+            </w:r>
+          </w:p>
+        </w:tc>
+      </w:tr>
+      <w:tr>
+        <w:tc>
+          <w:tcPr>
+            <w:tcW w:type="dxa" w:w="1440"/>
+            <w:shd w:fill="F8FAFC"/>
+            <w:tcMar>
+              <w:top w:w="100" w:type="dxa"/>
+              <w:bottom w:w="100" w:type="dxa"/>
+              <w:left w:w="120" w:type="dxa"/>
+              <w:right w:w="120" w:type="dxa"/>
+            </w:tcMar>
+          </w:tcPr>
+          <w:p>
+            <w:pPr>
+              <w:jc w:val="left"/>
+            </w:pPr>
+            <w:r>
+              <w:rPr>
+                <w:b/>
+                <w:sz w:val="17"/>
+              </w:rPr>
+              <w:t>Playbook 04: 1930s WET Systems</w:t>
+            </w:r>
+          </w:p>
+        </w:tc>
+        <w:tc>
+          <w:tcPr>
+            <w:tcW w:type="dxa" w:w="1440"/>
+            <w:shd w:fill="F8FAFC"/>
+            <w:tcMar>
+              <w:top w:w="100" w:type="dxa"/>
+              <w:bottom w:w="100" w:type="dxa"/>
+              <w:left w:w="120" w:type="dxa"/>
+              <w:right w:w="120" w:type="dxa"/>
+            </w:tcMar>
+          </w:tcPr>
+          <w:p>
+            <w:pPr>
+              <w:jc w:val="right"/>
+            </w:pPr>
+            <w:r>
+              <w:rPr>
+                <w:sz w:val="17"/>
+              </w:rPr>
+              <w:t>$1.50B (Net)</w:t>
+            </w:r>
+          </w:p>
+        </w:tc>
+        <w:tc>
+          <w:tcPr>
+            <w:tcW w:type="dxa" w:w="1440"/>
+            <w:shd w:fill="F8FAFC"/>
+            <w:tcMar>
+              <w:top w:w="100" w:type="dxa"/>
+              <w:bottom w:w="100" w:type="dxa"/>
+              <w:left w:w="120" w:type="dxa"/>
+              <w:right w:w="120" w:type="dxa"/>
+            </w:tcMar>
+          </w:tcPr>
+          <w:p>
+            <w:pPr>
+              <w:jc w:val="right"/>
+            </w:pPr>
+            <w:r>
+              <w:rPr>
+                <w:sz w:val="17"/>
+              </w:rPr>
+              <w:t>$4.50M / yr</w:t>
+            </w:r>
+          </w:p>
+        </w:tc>
+        <w:tc>
+          <w:tcPr>
+            <w:tcW w:type="dxa" w:w="1440"/>
+            <w:shd w:fill="F8FAFC"/>
+            <w:tcMar>
+              <w:top w:w="100" w:type="dxa"/>
+              <w:bottom w:w="100" w:type="dxa"/>
+              <w:left w:w="120" w:type="dxa"/>
+              <w:right w:w="120" w:type="dxa"/>
+            </w:tcMar>
+          </w:tcPr>
+          <w:p>
+            <w:pPr>
+              <w:jc w:val="right"/>
+            </w:pPr>
+            <w:r>
+              <w:rPr>
+                <w:sz w:val="17"/>
+              </w:rPr>
+              <w:t>$122.39M</w:t>
+            </w:r>
+          </w:p>
+        </w:tc>
+        <w:tc>
+          <w:tcPr>
+            <w:tcW w:type="dxa" w:w="1440"/>
+            <w:shd w:fill="F8FAFC"/>
+            <w:tcMar>
+              <w:top w:w="100" w:type="dxa"/>
+              <w:bottom w:w="100" w:type="dxa"/>
+              <w:left w:w="120" w:type="dxa"/>
+              <w:right w:w="120" w:type="dxa"/>
+            </w:tcMar>
+          </w:tcPr>
+          <w:p>
+            <w:pPr>
+              <w:jc w:val="right"/>
+            </w:pPr>
+            <w:r>
+              <w:rPr>
+                <w:sz w:val="17"/>
+              </w:rPr>
+              <w:t>$117.89M</w:t>
+            </w:r>
+          </w:p>
+        </w:tc>
+        <w:tc>
+          <w:tcPr>
+            <w:tcW w:type="dxa" w:w="1440"/>
+            <w:shd w:fill="F8FAFC"/>
+            <w:tcMar>
+              <w:top w:w="100" w:type="dxa"/>
+              <w:bottom w:w="100" w:type="dxa"/>
+              <w:left w:w="120" w:type="dxa"/>
+              <w:right w:w="120" w:type="dxa"/>
+            </w:tcMar>
+          </w:tcPr>
+          <w:p>
+            <w:pPr>
+              <w:jc w:val="center"/>
+            </w:pPr>
+            <w:r>
+              <w:rPr>
+                <w:sz w:val="17"/>
+              </w:rPr>
+              <w:t>12.25 Yrs</w:t>
+            </w:r>
+          </w:p>
+        </w:tc>
+        <w:tc>
+          <w:tcPr>
+            <w:tcW w:type="dxa" w:w="1440"/>
+            <w:shd w:fill="F8FAFC"/>
+            <w:tcMar>
+              <w:top w:w="100" w:type="dxa"/>
+              <w:bottom w:w="100" w:type="dxa"/>
+              <w:left w:w="120" w:type="dxa"/>
+              <w:right w:w="120" w:type="dxa"/>
+            </w:tcMar>
+          </w:tcPr>
+          <w:p>
+            <w:pPr>
+              <w:jc w:val="left"/>
+            </w:pPr>
+            <w:r>
+              <w:rPr>
+                <w:sz w:val="17"/>
+              </w:rPr>
+              <w:t>Wastewater heat recovery + 50% PPP grant ($749M), anti-fouling flushing.</w:t>
+            </w:r>
+          </w:p>
+        </w:tc>
+      </w:tr>
+      <w:tr>
+        <w:tc>
+          <w:tcPr>
+            <w:tcW w:type="dxa" w:w="1440"/>
+            <w:shd w:fill="FFFFFF"/>
+            <w:tcMar>
+              <w:top w:w="100" w:type="dxa"/>
+              <w:bottom w:w="100" w:type="dxa"/>
+              <w:left w:w="120" w:type="dxa"/>
+              <w:right w:w="120" w:type="dxa"/>
+            </w:tcMar>
+          </w:tcPr>
+          <w:p>
+            <w:pPr>
+              <w:jc w:val="left"/>
+            </w:pPr>
+            <w:r>
+              <w:rPr>
+                <w:b/>
+                <w:sz w:val="17"/>
+              </w:rPr>
+              <w:t>Playbook 05: Electrification Push</w:t>
+            </w:r>
+          </w:p>
+        </w:tc>
+        <w:tc>
+          <w:tcPr>
+            <w:tcW w:type="dxa" w:w="1440"/>
+            <w:shd w:fill="FFFFFF"/>
+            <w:tcMar>
+              <w:top w:w="100" w:type="dxa"/>
+              <w:bottom w:w="100" w:type="dxa"/>
+              <w:left w:w="120" w:type="dxa"/>
+              <w:right w:w="120" w:type="dxa"/>
+            </w:tcMar>
+          </w:tcPr>
+          <w:p>
+            <w:pPr>
+              <w:jc w:val="right"/>
+            </w:pPr>
+            <w:r>
+              <w:rPr>
+                <w:sz w:val="17"/>
+              </w:rPr>
+              <w:t>$1.89B</w:t>
+            </w:r>
+          </w:p>
+        </w:tc>
+        <w:tc>
+          <w:tcPr>
+            <w:tcW w:type="dxa" w:w="1440"/>
+            <w:shd w:fill="FFFFFF"/>
+            <w:tcMar>
+              <w:top w:w="100" w:type="dxa"/>
+              <w:bottom w:w="100" w:type="dxa"/>
+              <w:left w:w="120" w:type="dxa"/>
+              <w:right w:w="120" w:type="dxa"/>
+            </w:tcMar>
+          </w:tcPr>
+          <w:p>
+            <w:pPr>
+              <w:jc w:val="right"/>
+            </w:pPr>
+            <w:r>
+              <w:rPr>
+                <w:sz w:val="17"/>
+              </w:rPr>
+              <w:t>$5.10M / yr</w:t>
+            </w:r>
+          </w:p>
+        </w:tc>
+        <w:tc>
+          <w:tcPr>
+            <w:tcW w:type="dxa" w:w="1440"/>
+            <w:shd w:fill="FFFFFF"/>
+            <w:tcMar>
+              <w:top w:w="100" w:type="dxa"/>
+              <w:bottom w:w="100" w:type="dxa"/>
+              <w:left w:w="120" w:type="dxa"/>
+              <w:right w:w="120" w:type="dxa"/>
+            </w:tcMar>
+          </w:tcPr>
+          <w:p>
+            <w:pPr>
+              <w:jc w:val="right"/>
+            </w:pPr>
+            <w:r>
+              <w:rPr>
+                <w:sz w:val="17"/>
+              </w:rPr>
+              <w:t>$181.99M</w:t>
+            </w:r>
+          </w:p>
+        </w:tc>
+        <w:tc>
+          <w:tcPr>
+            <w:tcW w:type="dxa" w:w="1440"/>
+            <w:shd w:fill="FFFFFF"/>
+            <w:tcMar>
+              <w:top w:w="100" w:type="dxa"/>
+              <w:bottom w:w="100" w:type="dxa"/>
+              <w:left w:w="120" w:type="dxa"/>
+              <w:right w:w="120" w:type="dxa"/>
+            </w:tcMar>
+          </w:tcPr>
+          <w:p>
+            <w:pPr>
+              <w:jc w:val="right"/>
+            </w:pPr>
+            <w:r>
+              <w:rPr>
+                <w:sz w:val="17"/>
+              </w:rPr>
+              <w:t>$176.89M</w:t>
+            </w:r>
+          </w:p>
+        </w:tc>
+        <w:tc>
+          <w:tcPr>
+            <w:tcW w:type="dxa" w:w="1440"/>
+            <w:shd w:fill="FFFFFF"/>
+            <w:tcMar>
+              <w:top w:w="100" w:type="dxa"/>
+              <w:bottom w:w="100" w:type="dxa"/>
+              <w:left w:w="120" w:type="dxa"/>
+              <w:right w:w="120" w:type="dxa"/>
+            </w:tcMar>
+          </w:tcPr>
+          <w:p>
+            <w:pPr>
+              <w:jc w:val="center"/>
+            </w:pPr>
+            <w:r>
+              <w:rPr>
+                <w:sz w:val="17"/>
+              </w:rPr>
+              <w:t>10.38 Yrs</w:t>
+            </w:r>
+          </w:p>
+        </w:tc>
+        <w:tc>
+          <w:tcPr>
+            <w:tcW w:type="dxa" w:w="1440"/>
+            <w:shd w:fill="FFFFFF"/>
+            <w:tcMar>
+              <w:top w:w="100" w:type="dxa"/>
+              <w:bottom w:w="100" w:type="dxa"/>
+              <w:left w:w="120" w:type="dxa"/>
+              <w:right w:w="120" w:type="dxa"/>
+            </w:tcMar>
+          </w:tcPr>
+          <w:p>
+            <w:pPr>
+              <w:jc w:val="left"/>
+            </w:pPr>
+            <w:r>
+              <w:rPr>
+                <w:sz w:val="17"/>
+              </w:rPr>
+              <w:t>Electric Heat Pumps ($20/ft²), OEM service contracts &amp; thermal scanning.</w:t>
+            </w:r>
+          </w:p>
+        </w:tc>
+      </w:tr>
+      <w:tr>
+        <w:tc>
+          <w:tcPr>
+            <w:tcW w:type="dxa" w:w="1440"/>
+            <w:shd w:fill="ECFDF5"/>
+            <w:tcMar>
+              <w:top w:w="100" w:type="dxa"/>
+              <w:bottom w:w="100" w:type="dxa"/>
+              <w:left w:w="120" w:type="dxa"/>
+              <w:right w:w="120" w:type="dxa"/>
+            </w:tcMar>
+          </w:tcPr>
+          <w:p>
+            <w:pPr>
+              <w:jc w:val="left"/>
+            </w:pPr>
+            <w:r>
+              <w:rPr>
+                <w:b/>
+                <w:color w:val="065F46"/>
+                <w:sz w:val="17"/>
+              </w:rPr>
+              <w:t>TOTAL PORTFOLIO STRATEGY</w:t>
+            </w:r>
+          </w:p>
+        </w:tc>
+        <w:tc>
+          <w:tcPr>
+            <w:tcW w:type="dxa" w:w="1440"/>
+            <w:shd w:fill="ECFDF5"/>
+            <w:tcMar>
+              <w:top w:w="100" w:type="dxa"/>
+              <w:bottom w:w="100" w:type="dxa"/>
+              <w:left w:w="120" w:type="dxa"/>
+              <w:right w:w="120" w:type="dxa"/>
+            </w:tcMar>
+          </w:tcPr>
+          <w:p>
+            <w:pPr>
+              <w:jc w:val="right"/>
+            </w:pPr>
+            <w:r>
+              <w:rPr>
+                <w:b/>
+                <w:color w:val="065F46"/>
+                <w:sz w:val="17"/>
+              </w:rPr>
+              <w:t>$4.98B</w:t>
+            </w:r>
+          </w:p>
+        </w:tc>
+        <w:tc>
+          <w:tcPr>
+            <w:tcW w:type="dxa" w:w="1440"/>
+            <w:shd w:fill="ECFDF5"/>
+            <w:tcMar>
+              <w:top w:w="100" w:type="dxa"/>
+              <w:bottom w:w="100" w:type="dxa"/>
+              <w:left w:w="120" w:type="dxa"/>
+              <w:right w:w="120" w:type="dxa"/>
+            </w:tcMar>
+          </w:tcPr>
+          <w:p>
+            <w:pPr>
+              <w:jc w:val="right"/>
+            </w:pPr>
+            <w:r>
+              <w:rPr>
+                <w:b/>
+                <w:color w:val="065F46"/>
+                <w:sz w:val="17"/>
+              </w:rPr>
+              <w:t>$15.70M / yr</w:t>
+            </w:r>
+          </w:p>
+        </w:tc>
+        <w:tc>
+          <w:tcPr>
+            <w:tcW w:type="dxa" w:w="1440"/>
+            <w:shd w:fill="ECFDF5"/>
+            <w:tcMar>
+              <w:top w:w="100" w:type="dxa"/>
+              <w:bottom w:w="100" w:type="dxa"/>
+              <w:left w:w="120" w:type="dxa"/>
+              <w:right w:w="120" w:type="dxa"/>
+            </w:tcMar>
+          </w:tcPr>
+          <w:p>
+            <w:pPr>
+              <w:jc w:val="right"/>
+            </w:pPr>
+            <w:r>
+              <w:rPr>
+                <w:b/>
+                <w:color w:val="065F46"/>
+                <w:sz w:val="17"/>
+              </w:rPr>
+              <w:t>$656.63M</w:t>
+            </w:r>
+          </w:p>
+        </w:tc>
+        <w:tc>
+          <w:tcPr>
+            <w:tcW w:type="dxa" w:w="1440"/>
+            <w:shd w:fill="ECFDF5"/>
+            <w:tcMar>
+              <w:top w:w="100" w:type="dxa"/>
+              <w:bottom w:w="100" w:type="dxa"/>
+              <w:left w:w="120" w:type="dxa"/>
+              <w:right w:w="120" w:type="dxa"/>
+            </w:tcMar>
+          </w:tcPr>
+          <w:p>
+            <w:pPr>
+              <w:jc w:val="right"/>
+            </w:pPr>
+            <w:r>
+              <w:rPr>
+                <w:b/>
+                <w:color w:val="065F46"/>
+                <w:sz w:val="17"/>
+              </w:rPr>
+              <w:t>$640.93M</w:t>
+            </w:r>
+          </w:p>
+        </w:tc>
+        <w:tc>
+          <w:tcPr>
+            <w:tcW w:type="dxa" w:w="1440"/>
+            <w:shd w:fill="ECFDF5"/>
+            <w:tcMar>
+              <w:top w:w="100" w:type="dxa"/>
+              <w:bottom w:w="100" w:type="dxa"/>
+              <w:left w:w="120" w:type="dxa"/>
+              <w:right w:w="120" w:type="dxa"/>
+            </w:tcMar>
+          </w:tcPr>
+          <w:p>
+            <w:pPr>
+              <w:jc w:val="center"/>
+            </w:pPr>
+            <w:r>
+              <w:rPr>
+                <w:b/>
+                <w:color w:val="065F46"/>
+                <w:sz w:val="17"/>
+              </w:rPr>
+              <w:t>6.97 Yrs Blended</w:t>
+            </w:r>
+          </w:p>
+        </w:tc>
+        <w:tc>
+          <w:tcPr>
+            <w:tcW w:type="dxa" w:w="1440"/>
+            <w:shd w:fill="ECFDF5"/>
+            <w:tcMar>
+              <w:top w:w="100" w:type="dxa"/>
+              <w:bottom w:w="100" w:type="dxa"/>
+              <w:left w:w="120" w:type="dxa"/>
+              <w:right w:w="120" w:type="dxa"/>
+            </w:tcMar>
+          </w:tcPr>
+          <w:p>
+            <w:pPr>
+              <w:jc w:val="left"/>
+            </w:pPr>
+            <w:r>
+              <w:rPr>
+                <w:b/>
+                <w:color w:val="065F46"/>
+                <w:sz w:val="17"/>
+              </w:rPr>
+              <w:t>OPEX is only 0.32% of CAPEX, yielding 97.6% net recurring cash flow.</w:t>
+            </w:r>
+          </w:p>
+        </w:tc>
+      </w:tr>
+    </w:tbl>
     <w:p>
       <w:pPr>
         <w:spacing w:after="80"/>

</xml_diff>

<commit_message>
Update official Word documentation (DOCX) with Layer 6 AI Executive Co-Pilot & Dual-Engine Chatbot architecture and end-user instructions
</commit_message>
<xml_diff>
--- a/docs/Carbon_Heist_Mitigation_Documentation.docx
+++ b/docs/Carbon_Heist_Mitigation_Documentation.docx
@@ -7999,14 +7999,7 @@
         <w:spacing w:before="200" w:after="100"/>
       </w:pPr>
       <w:r>
-        <w:rPr>
-          <w:b/>
-          <w:bCs/>
-          <w:color w:val="1F7A6E"/>
-          <w:sz w:val="22"/>
-          <w:szCs w:val="22"/>
-        </w:rPr>
-        <w:t>Five-Pillar Architecture</w:t>
+        <w:t>Six-Pillar Dual-Engine Architecture (including AI Executive Chatbot)</w:t>
       </w:r>
     </w:p>
     <w:tbl>
@@ -8625,6 +8618,48 @@
                 <w:szCs w:val="19"/>
               </w:rPr>
               <w:t>Excel Modeling</w:t>
+            </w:r>
+          </w:p>
+        </w:tc>
+      </w:tr>
+      <w:tr>
+        <w:tc>
+          <w:tcPr>
+            <w:tcW w:type="dxa" w:w="1900"/>
+          </w:tcPr>
+          <w:p>
+            <w:r>
+              <w:t>6. AI Co-Pilot</w:t>
+            </w:r>
+          </w:p>
+        </w:tc>
+        <w:tc>
+          <w:tcPr>
+            <w:tcW w:type="dxa" w:w="2350"/>
+          </w:tcPr>
+          <w:p>
+            <w:r>
+              <w:t>Dual-Engine Chatbot</w:t>
+            </w:r>
+          </w:p>
+        </w:tc>
+        <w:tc>
+          <w:tcPr>
+            <w:tcW w:type="dxa" w:w="2900"/>
+          </w:tcPr>
+          <w:p>
+            <w:r>
+              <w:t>app.py (Gemini + Local)</w:t>
+            </w:r>
+          </w:p>
+        </w:tc>
+        <w:tc>
+          <w:tcPr>
+            <w:tcW w:type="dxa" w:w="2200"/>
+          </w:tcPr>
+          <w:p>
+            <w:r>
+              <w:t>Google Gemini 2.5 Flash, Plotly</w:t>
             </w:r>
           </w:p>
         </w:tc>
@@ -15686,6 +15721,11 @@
       </w:r>
     </w:p>
     <w:p>
+      <w:r>
+        <w:t>Step 4 – AI Chatbot: Ask natural-language strategic questions or query 'top 10 buildings' to render instant interactive Plotly charts and executive audits (Dual-Engine: Gemini 2.5 Flash + Local Fallback).</w:t>
+      </w:r>
+    </w:p>
+    <w:p>
       <w:pPr>
         <w:pStyle w:val="ListParagraph"/>
         <w:numPr>
@@ -15695,15 +15735,7 @@
         <w:spacing w:after="100" w:line="280" w:lineRule="auto"/>
       </w:pPr>
       <w:r>
-        <w:rPr>
-          <w:b/>
-          <w:bCs/>
-          <w:color w:val="0B3D2E"/>
-        </w:rPr>
-        <w:t xml:space="preserve">Step 3 – Simulate: </w:t>
-      </w:r>
-      <w:r>
-        <w:t>Model HVAC, insulation, and electrification upgrades for penalty savings.</w:t>
+        <w:t>Step 3 – Simulate: Model HVAC, insulation, and electrification upgrades for penalty savings.</w:t>
       </w:r>
     </w:p>
     <w:p>

</xml_diff>